<commit_message>
fix: preserve mixed-format dates from data dictionary
</commit_message>
<xml_diff>
--- a/deliverables/Quoter_Tech1a_summary.docx
+++ b/deliverables/Quoter_Tech1a_summary.docx
@@ -46,7 +46,7 @@
           <w:color w:val="505862"/>
           <w:sz w:val="20"/>
         </w:rPr>
-        <w:t>Technical Challenge Summary | 5,000 fictional records across Hospitals A-J | 21 August 2026</w:t>
+        <w:t>Technical Challenge Summary | 5,000 fictional records across Hospitals A-J | 30 August 2026</w:t>
       </w:r>
     </w:p>
     <w:tbl>
@@ -269,7 +269,7 @@
           <w:i w:val="0"/>
           <w:sz w:val="20"/>
         </w:rPr>
-        <w:t>The software factory ingested the readable hospital workbook and data dictionary, profiled all 23 source fields, applied governed deterministic rules, preserved row-level traceability, generated a 26-field cleanfile, and consolidated the records into a 15-field national consumable item master. The process produced 24,886 field-level change records and retained 3,549 records in a human-review queue rather than silently resolving ambiguous conditions.</w:t>
+        <w:t>The software factory ingested the readable hospital workbook and data dictionary, profiled all 23 source fields, applied governed deterministic rules, preserved row-level traceability, generated a 26-field cleanfile, and consolidated the records into a 15-field national consumable item master. The process produced 24,886 field-level change records and retained 3,635 records in a human-review queue rather than silently resolving ambiguous conditions.</w:t>
       </w:r>
     </w:p>
     <w:p>
@@ -1599,7 +1599,7 @@
                 <w:i w:val="0"/>
                 <w:sz w:val="20"/>
               </w:rPr>
-              <w:t>Format dates as YYYY-MM-DD; coerce price and quantities to numeric values.</w:t>
+              <w:t>Parse mixed Excel/ISO/US dates to YYYY-MM-DD; coerce price and quantities to numeric values.</w:t>
             </w:r>
           </w:p>
         </w:tc>
@@ -1625,7 +1625,7 @@
                 <w:i w:val="0"/>
                 <w:sz w:val="20"/>
               </w:rPr>
-              <w:t>Comparable values across hospitals.</w:t>
+              <w:t>Valid source dates are retained; unparseable values are flagged.</w:t>
             </w:r>
           </w:p>
         </w:tc>
@@ -1879,7 +1879,7 @@
                 <w:i w:val="0"/>
                 <w:sz w:val="20"/>
               </w:rPr>
-              <w:t>1,320 records</w:t>
+              <w:t>1,310 records</w:t>
             </w:r>
           </w:p>
         </w:tc>
@@ -2042,7 +2042,7 @@
                 <w:i w:val="0"/>
                 <w:sz w:val="20"/>
               </w:rPr>
-              <w:t>Governance exception</w:t>
+              <w:t>1,899 records</w:t>
             </w:r>
           </w:p>
         </w:tc>
@@ -2124,7 +2124,7 @@
                 <w:i w:val="0"/>
                 <w:sz w:val="20"/>
               </w:rPr>
-              <w:t>3,616 records</w:t>
+              <w:t>3,625 records</w:t>
             </w:r>
           </w:p>
         </w:tc>
@@ -2967,7 +2967,7 @@
           <w:i w:val="0"/>
           <w:sz w:val="20"/>
         </w:rPr>
-        <w:t>Named gates accept source context, business rules, SME decisions, and the final package. The 3,549-record review queue exposes affected SBRNs, issue flags, decision owner, and status. A production owner must resolve recall vocabulary, date anomalies, unit conversions with business meaning, uncertain item matches, and source-system corrections. Approval records must capture actor, decision, reason, timestamp, and the exact artifact version reviewed.</w:t>
+        <w:t>Named gates accept source context, business rules, SME decisions, and the final package. The 3,635-record review queue exposes affected SBRNs, issue flags, decision owner, and status. A production owner must resolve recall vocabulary, date anomalies, unit conversions with business meaning, uncertain item matches, and source-system corrections. Approval records must capture actor, decision, reason, timestamp, and the exact artifact version reviewed.</w:t>
       </w:r>
     </w:p>
     <w:p>
@@ -3726,7 +3726,7 @@
                 <w:color w:val="FFFFFF"/>
                 <w:sz w:val="32"/>
               </w:rPr>
-              <w:t>3,549</w:t>
+              <w:t>3,635</w:t>
             </w:r>
           </w:p>
           <w:p>

</xml_diff>